<commit_message>
Add: Modelo lógico e SQL refeitos.
</commit_message>
<xml_diff>
--- a/public/assets/docs/Trabalho APO FPI.docx
+++ b/public/assets/docs/Trabalho APO FPI.docx
@@ -88,1970 +88,6 @@
         <w:t xml:space="preserve"> O sistema irá registrar as rotas em que o pedido se encontra, registrando as paradas e as informações relacionadas a ela. Possui uma forma de rastreamento para cada remessa que será enviada e seus status. O sistema vai registrar as entregas que foram realizadas e as informações que foram obtidas sobre cada uma delas. </w:t>
       </w:r>
     </w:p>
-    <w:p/>
-    <w:p>
-      <w:pPr>
-        <w:rPr>
-          <w:b/>
-          <w:bCs/>
-          <w:sz w:val="28"/>
-          <w:szCs w:val="28"/>
-          <w:u w:val="single"/>
-        </w:rPr>
-      </w:pPr>
-      <w:r>
-        <w:rPr>
-          <w:b/>
-          <w:bCs/>
-          <w:sz w:val="28"/>
-          <w:szCs w:val="28"/>
-          <w:u w:val="single"/>
-        </w:rPr>
-        <w:t>ESTRUTURA DE TABELAS DO BANCO DE DADOS</w:t>
-      </w:r>
-      <w:r>
-        <w:rPr>
-          <w:b/>
-          <w:bCs/>
-          <w:sz w:val="28"/>
-          <w:szCs w:val="28"/>
-          <w:u w:val="single"/>
-        </w:rPr>
-        <w:t>:</w:t>
-      </w:r>
-    </w:p>
-    <w:tbl>
-      <w:tblPr>
-        <w:tblStyle w:val="Tabelacomgrade"/>
-        <w:tblW w:w="9092" w:type="dxa"/>
-        <w:tblLook w:val="04A0" w:firstRow="1" w:lastRow="0" w:firstColumn="1" w:lastColumn="0" w:noHBand="0" w:noVBand="1"/>
-      </w:tblPr>
-      <w:tblGrid>
-        <w:gridCol w:w="4466"/>
-        <w:gridCol w:w="4626"/>
-      </w:tblGrid>
-      <w:tr>
-        <w:trPr>
-          <w:trHeight w:val="427"/>
-        </w:trPr>
-        <w:tc>
-          <w:tcPr>
-            <w:tcW w:w="4466" w:type="dxa"/>
-          </w:tcPr>
-          <w:tbl>
-            <w:tblPr>
-              <w:tblW w:w="0" w:type="auto"/>
-              <w:tblCellSpacing w:w="15" w:type="dxa"/>
-              <w:tblCellMar>
-                <w:top w:w="15" w:type="dxa"/>
-                <w:left w:w="15" w:type="dxa"/>
-                <w:bottom w:w="15" w:type="dxa"/>
-                <w:right w:w="15" w:type="dxa"/>
-              </w:tblCellMar>
-              <w:tblLook w:val="04A0" w:firstRow="1" w:lastRow="0" w:firstColumn="1" w:lastColumn="0" w:noHBand="0" w:noVBand="1"/>
-            </w:tblPr>
-            <w:tblGrid>
-              <w:gridCol w:w="797"/>
-            </w:tblGrid>
-            <w:tr>
-              <w:trPr>
-                <w:tblCellSpacing w:w="15" w:type="dxa"/>
-              </w:trPr>
-              <w:tc>
-                <w:tcPr>
-                  <w:tcW w:w="0" w:type="auto"/>
-                  <w:vAlign w:val="center"/>
-                  <w:hideMark/>
-                </w:tcPr>
-                <w:p>
-                  <w:pPr>
-                    <w:pStyle w:val="w6asjqtextbase"/>
-                    <w:jc w:val="center"/>
-                    <w:rPr>
-                      <w:b/>
-                      <w:bCs/>
-                    </w:rPr>
-                  </w:pPr>
-                  <w:r>
-                    <w:rPr>
-                      <w:b/>
-                      <w:bCs/>
-                    </w:rPr>
-                    <w:t>Tabela</w:t>
-                  </w:r>
-                </w:p>
-              </w:tc>
-            </w:tr>
-          </w:tbl>
-          <w:p/>
-        </w:tc>
-        <w:tc>
-          <w:tcPr>
-            <w:tcW w:w="4626" w:type="dxa"/>
-          </w:tcPr>
-          <w:tbl>
-            <w:tblPr>
-              <w:tblW w:w="0" w:type="auto"/>
-              <w:tblCellSpacing w:w="15" w:type="dxa"/>
-              <w:tblCellMar>
-                <w:top w:w="15" w:type="dxa"/>
-                <w:left w:w="15" w:type="dxa"/>
-                <w:bottom w:w="15" w:type="dxa"/>
-                <w:right w:w="15" w:type="dxa"/>
-              </w:tblCellMar>
-              <w:tblLook w:val="04A0" w:firstRow="1" w:lastRow="0" w:firstColumn="1" w:lastColumn="0" w:noHBand="0" w:noVBand="1"/>
-            </w:tblPr>
-            <w:tblGrid>
-              <w:gridCol w:w="782"/>
-              <w:gridCol w:w="1876"/>
-            </w:tblGrid>
-            <w:tr>
-              <w:trPr>
-                <w:tblCellSpacing w:w="15" w:type="dxa"/>
-              </w:trPr>
-              <w:tc>
-                <w:tcPr>
-                  <w:tcW w:w="0" w:type="auto"/>
-                  <w:vAlign w:val="center"/>
-                  <w:hideMark/>
-                </w:tcPr>
-                <w:p>
-                  <w:pPr>
-                    <w:pStyle w:val="w6asjqtextbase"/>
-                    <w:jc w:val="center"/>
-                    <w:rPr>
-                      <w:b/>
-                      <w:bCs/>
-                    </w:rPr>
-                  </w:pPr>
-                  <w:r>
-                    <w:rPr>
-                      <w:b/>
-                      <w:bCs/>
-                    </w:rPr>
-                    <w:t>Tabela</w:t>
-                  </w:r>
-                </w:p>
-              </w:tc>
-              <w:tc>
-                <w:tcPr>
-                  <w:tcW w:w="0" w:type="auto"/>
-                  <w:vAlign w:val="center"/>
-                  <w:hideMark/>
-                </w:tcPr>
-                <w:p>
-                  <w:pPr>
-                    <w:pStyle w:val="w6asjqtextbase"/>
-                    <w:jc w:val="center"/>
-                    <w:rPr>
-                      <w:b/>
-                      <w:bCs/>
-                    </w:rPr>
-                  </w:pPr>
-                  <w:r>
-                    <w:rPr>
-                      <w:b/>
-                      <w:bCs/>
-                    </w:rPr>
-                    <w:t>Responsabilidade</w:t>
-                  </w:r>
-                </w:p>
-              </w:tc>
-            </w:tr>
-          </w:tbl>
-          <w:p/>
-        </w:tc>
-      </w:tr>
-      <w:tr>
-        <w:trPr>
-          <w:trHeight w:val="427"/>
-        </w:trPr>
-        <w:tc>
-          <w:tcPr>
-            <w:tcW w:w="4466" w:type="dxa"/>
-          </w:tcPr>
-          <w:tbl>
-            <w:tblPr>
-              <w:tblW w:w="0" w:type="auto"/>
-              <w:tblCellSpacing w:w="15" w:type="dxa"/>
-              <w:tblCellMar>
-                <w:top w:w="15" w:type="dxa"/>
-                <w:left w:w="15" w:type="dxa"/>
-                <w:bottom w:w="15" w:type="dxa"/>
-                <w:right w:w="15" w:type="dxa"/>
-              </w:tblCellMar>
-              <w:tblLook w:val="04A0" w:firstRow="1" w:lastRow="0" w:firstColumn="1" w:lastColumn="0" w:noHBand="0" w:noVBand="1"/>
-            </w:tblPr>
-            <w:tblGrid>
-              <w:gridCol w:w="1036"/>
-              <w:gridCol w:w="81"/>
-            </w:tblGrid>
-            <w:tr>
-              <w:trPr>
-                <w:tblCellSpacing w:w="15" w:type="dxa"/>
-              </w:trPr>
-              <w:tc>
-                <w:tcPr>
-                  <w:tcW w:w="0" w:type="auto"/>
-                  <w:vAlign w:val="center"/>
-                  <w:hideMark/>
-                </w:tcPr>
-                <w:p>
-                  <w:pPr>
-                    <w:pStyle w:val="w6asjqtextbase"/>
-                  </w:pPr>
-                  <w:proofErr w:type="spellStart"/>
-                  <w:r>
-                    <w:rPr>
-                      <w:rStyle w:val="CdigoHTML"/>
-                    </w:rPr>
-                    <w:t>usuarios</w:t>
-                  </w:r>
-                  <w:proofErr w:type="spellEnd"/>
-                </w:p>
-              </w:tc>
-              <w:tc>
-                <w:tcPr>
-                  <w:tcW w:w="0" w:type="auto"/>
-                  <w:vAlign w:val="center"/>
-                  <w:hideMark/>
-                </w:tcPr>
-                <w:p>
-                  <w:pPr>
-                    <w:pStyle w:val="w6asjqtextbase"/>
-                  </w:pPr>
-                </w:p>
-              </w:tc>
-            </w:tr>
-          </w:tbl>
-          <w:p/>
-        </w:tc>
-        <w:tc>
-          <w:tcPr>
-            <w:tcW w:w="4626" w:type="dxa"/>
-          </w:tcPr>
-          <w:tbl>
-            <w:tblPr>
-              <w:tblW w:w="0" w:type="auto"/>
-              <w:tblCellSpacing w:w="15" w:type="dxa"/>
-              <w:tblCellMar>
-                <w:top w:w="15" w:type="dxa"/>
-                <w:left w:w="15" w:type="dxa"/>
-                <w:bottom w:w="15" w:type="dxa"/>
-                <w:right w:w="15" w:type="dxa"/>
-              </w:tblCellMar>
-              <w:tblLook w:val="04A0" w:firstRow="1" w:lastRow="0" w:firstColumn="1" w:lastColumn="0" w:noHBand="0" w:noVBand="1"/>
-            </w:tblPr>
-            <w:tblGrid>
-              <w:gridCol w:w="297"/>
-              <w:gridCol w:w="3580"/>
-            </w:tblGrid>
-            <w:tr>
-              <w:trPr>
-                <w:tblCellSpacing w:w="15" w:type="dxa"/>
-              </w:trPr>
-              <w:tc>
-                <w:tcPr>
-                  <w:tcW w:w="252" w:type="dxa"/>
-                  <w:vAlign w:val="center"/>
-                  <w:hideMark/>
-                </w:tcPr>
-                <w:p>
-                  <w:pPr>
-                    <w:pStyle w:val="w6asjqtextbase"/>
-                  </w:pPr>
-                </w:p>
-              </w:tc>
-              <w:tc>
-                <w:tcPr>
-                  <w:tcW w:w="3535" w:type="dxa"/>
-                  <w:vAlign w:val="center"/>
-                  <w:hideMark/>
-                </w:tcPr>
-                <w:p>
-                  <w:pPr>
-                    <w:pStyle w:val="w6asjqtextbase"/>
-                  </w:pPr>
-                  <w:r>
-                    <w:t>Contas de acesso ao sistema.</w:t>
-                  </w:r>
-                </w:p>
-              </w:tc>
-            </w:tr>
-          </w:tbl>
-          <w:p/>
-        </w:tc>
-      </w:tr>
-      <w:tr>
-        <w:trPr>
-          <w:trHeight w:val="449"/>
-        </w:trPr>
-        <w:tc>
-          <w:tcPr>
-            <w:tcW w:w="4466" w:type="dxa"/>
-          </w:tcPr>
-          <w:tbl>
-            <w:tblPr>
-              <w:tblW w:w="0" w:type="auto"/>
-              <w:tblCellSpacing w:w="15" w:type="dxa"/>
-              <w:tblCellMar>
-                <w:top w:w="15" w:type="dxa"/>
-                <w:left w:w="15" w:type="dxa"/>
-                <w:bottom w:w="15" w:type="dxa"/>
-                <w:right w:w="15" w:type="dxa"/>
-              </w:tblCellMar>
-              <w:tblLook w:val="04A0" w:firstRow="1" w:lastRow="0" w:firstColumn="1" w:lastColumn="0" w:noHBand="0" w:noVBand="1"/>
-            </w:tblPr>
-            <w:tblGrid>
-              <w:gridCol w:w="811"/>
-            </w:tblGrid>
-            <w:tr>
-              <w:trPr>
-                <w:tblCellSpacing w:w="15" w:type="dxa"/>
-              </w:trPr>
-              <w:tc>
-                <w:tcPr>
-                  <w:tcW w:w="0" w:type="auto"/>
-                  <w:vAlign w:val="center"/>
-                  <w:hideMark/>
-                </w:tcPr>
-                <w:p>
-                  <w:pPr>
-                    <w:pStyle w:val="w6asjqtextbase"/>
-                  </w:pPr>
-                  <w:r>
-                    <w:rPr>
-                      <w:rStyle w:val="CdigoHTML"/>
-                    </w:rPr>
-                    <w:t>perfis</w:t>
-                  </w:r>
-                </w:p>
-              </w:tc>
-            </w:tr>
-          </w:tbl>
-          <w:p/>
-        </w:tc>
-        <w:tc>
-          <w:tcPr>
-            <w:tcW w:w="4626" w:type="dxa"/>
-          </w:tcPr>
-          <w:tbl>
-            <w:tblPr>
-              <w:tblW w:w="0" w:type="auto"/>
-              <w:tblCellSpacing w:w="15" w:type="dxa"/>
-              <w:tblCellMar>
-                <w:top w:w="15" w:type="dxa"/>
-                <w:left w:w="15" w:type="dxa"/>
-                <w:bottom w:w="15" w:type="dxa"/>
-                <w:right w:w="15" w:type="dxa"/>
-              </w:tblCellMar>
-              <w:tblLook w:val="04A0" w:firstRow="1" w:lastRow="0" w:firstColumn="1" w:lastColumn="0" w:noHBand="0" w:noVBand="1"/>
-            </w:tblPr>
-            <w:tblGrid>
-              <w:gridCol w:w="81"/>
-              <w:gridCol w:w="2948"/>
-            </w:tblGrid>
-            <w:tr>
-              <w:trPr>
-                <w:tblCellSpacing w:w="15" w:type="dxa"/>
-              </w:trPr>
-              <w:tc>
-                <w:tcPr>
-                  <w:tcW w:w="0" w:type="auto"/>
-                  <w:vAlign w:val="center"/>
-                  <w:hideMark/>
-                </w:tcPr>
-                <w:p>
-                  <w:pPr>
-                    <w:pStyle w:val="w6asjqtextbase"/>
-                  </w:pPr>
-                </w:p>
-              </w:tc>
-              <w:tc>
-                <w:tcPr>
-                  <w:tcW w:w="0" w:type="auto"/>
-                  <w:vAlign w:val="center"/>
-                  <w:hideMark/>
-                </w:tcPr>
-                <w:p>
-                  <w:pPr>
-                    <w:pStyle w:val="w6asjqtextbase"/>
-                  </w:pPr>
-                  <w:r>
-                    <w:t>Tipos de acesso e permissões.</w:t>
-                  </w:r>
-                </w:p>
-              </w:tc>
-            </w:tr>
-          </w:tbl>
-          <w:p/>
-        </w:tc>
-      </w:tr>
-      <w:tr>
-        <w:trPr>
-          <w:trHeight w:val="427"/>
-        </w:trPr>
-        <w:tc>
-          <w:tcPr>
-            <w:tcW w:w="4466" w:type="dxa"/>
-          </w:tcPr>
-          <w:tbl>
-            <w:tblPr>
-              <w:tblW w:w="0" w:type="auto"/>
-              <w:tblCellSpacing w:w="15" w:type="dxa"/>
-              <w:tblCellMar>
-                <w:top w:w="15" w:type="dxa"/>
-                <w:left w:w="15" w:type="dxa"/>
-                <w:bottom w:w="15" w:type="dxa"/>
-                <w:right w:w="15" w:type="dxa"/>
-              </w:tblCellMar>
-              <w:tblLook w:val="04A0" w:firstRow="1" w:lastRow="0" w:firstColumn="1" w:lastColumn="0" w:noHBand="0" w:noVBand="1"/>
-            </w:tblPr>
-            <w:tblGrid>
-              <w:gridCol w:w="1036"/>
-              <w:gridCol w:w="81"/>
-            </w:tblGrid>
-            <w:tr>
-              <w:trPr>
-                <w:tblCellSpacing w:w="15" w:type="dxa"/>
-              </w:trPr>
-              <w:tc>
-                <w:tcPr>
-                  <w:tcW w:w="0" w:type="auto"/>
-                  <w:vAlign w:val="center"/>
-                  <w:hideMark/>
-                </w:tcPr>
-                <w:p>
-                  <w:pPr>
-                    <w:pStyle w:val="w6asjqtextbase"/>
-                  </w:pPr>
-                  <w:r>
-                    <w:rPr>
-                      <w:rStyle w:val="CdigoHTML"/>
-                    </w:rPr>
-                    <w:t>clientes</w:t>
-                  </w:r>
-                </w:p>
-              </w:tc>
-              <w:tc>
-                <w:tcPr>
-                  <w:tcW w:w="0" w:type="auto"/>
-                  <w:vAlign w:val="center"/>
-                  <w:hideMark/>
-                </w:tcPr>
-                <w:p>
-                  <w:pPr>
-                    <w:pStyle w:val="w6asjqtextbase"/>
-                  </w:pPr>
-                </w:p>
-              </w:tc>
-            </w:tr>
-          </w:tbl>
-          <w:p/>
-        </w:tc>
-        <w:tc>
-          <w:tcPr>
-            <w:tcW w:w="4626" w:type="dxa"/>
-          </w:tcPr>
-          <w:tbl>
-            <w:tblPr>
-              <w:tblW w:w="0" w:type="auto"/>
-              <w:tblCellSpacing w:w="15" w:type="dxa"/>
-              <w:tblCellMar>
-                <w:top w:w="15" w:type="dxa"/>
-                <w:left w:w="15" w:type="dxa"/>
-                <w:bottom w:w="15" w:type="dxa"/>
-                <w:right w:w="15" w:type="dxa"/>
-              </w:tblCellMar>
-              <w:tblLook w:val="04A0" w:firstRow="1" w:lastRow="0" w:firstColumn="1" w:lastColumn="0" w:noHBand="0" w:noVBand="1"/>
-            </w:tblPr>
-            <w:tblGrid>
-              <w:gridCol w:w="81"/>
-              <w:gridCol w:w="4329"/>
-            </w:tblGrid>
-            <w:tr>
-              <w:trPr>
-                <w:tblCellSpacing w:w="15" w:type="dxa"/>
-              </w:trPr>
-              <w:tc>
-                <w:tcPr>
-                  <w:tcW w:w="0" w:type="auto"/>
-                  <w:vAlign w:val="center"/>
-                  <w:hideMark/>
-                </w:tcPr>
-                <w:p>
-                  <w:pPr>
-                    <w:pStyle w:val="w6asjqtextbase"/>
-                  </w:pPr>
-                </w:p>
-              </w:tc>
-              <w:tc>
-                <w:tcPr>
-                  <w:tcW w:w="0" w:type="auto"/>
-                  <w:vAlign w:val="center"/>
-                  <w:hideMark/>
-                </w:tcPr>
-                <w:p>
-                  <w:pPr>
-                    <w:pStyle w:val="w6asjqtextbase"/>
-                  </w:pPr>
-                  <w:r>
-                    <w:t>Pessoas ou empresas que contratam os serviços.</w:t>
-                  </w:r>
-                </w:p>
-              </w:tc>
-            </w:tr>
-          </w:tbl>
-          <w:p/>
-        </w:tc>
-      </w:tr>
-      <w:tr>
-        <w:trPr>
-          <w:trHeight w:val="427"/>
-        </w:trPr>
-        <w:tc>
-          <w:tcPr>
-            <w:tcW w:w="4466" w:type="dxa"/>
-          </w:tcPr>
-          <w:tbl>
-            <w:tblPr>
-              <w:tblW w:w="0" w:type="auto"/>
-              <w:tblCellSpacing w:w="15" w:type="dxa"/>
-              <w:tblCellMar>
-                <w:top w:w="15" w:type="dxa"/>
-                <w:left w:w="15" w:type="dxa"/>
-                <w:bottom w:w="15" w:type="dxa"/>
-                <w:right w:w="15" w:type="dxa"/>
-              </w:tblCellMar>
-              <w:tblLook w:val="04A0" w:firstRow="1" w:lastRow="0" w:firstColumn="1" w:lastColumn="0" w:noHBand="0" w:noVBand="1"/>
-            </w:tblPr>
-            <w:tblGrid>
-              <w:gridCol w:w="1171"/>
-            </w:tblGrid>
-            <w:tr>
-              <w:trPr>
-                <w:tblCellSpacing w:w="15" w:type="dxa"/>
-              </w:trPr>
-              <w:tc>
-                <w:tcPr>
-                  <w:tcW w:w="0" w:type="auto"/>
-                  <w:vAlign w:val="center"/>
-                  <w:hideMark/>
-                </w:tcPr>
-                <w:p>
-                  <w:pPr>
-                    <w:pStyle w:val="w6asjqtextbase"/>
-                  </w:pPr>
-                  <w:proofErr w:type="spellStart"/>
-                  <w:r>
-                    <w:rPr>
-                      <w:rStyle w:val="CdigoHTML"/>
-                    </w:rPr>
-                    <w:t>enderecos</w:t>
-                  </w:r>
-                  <w:proofErr w:type="spellEnd"/>
-                </w:p>
-              </w:tc>
-            </w:tr>
-          </w:tbl>
-          <w:p/>
-        </w:tc>
-        <w:tc>
-          <w:tcPr>
-            <w:tcW w:w="4626" w:type="dxa"/>
-          </w:tcPr>
-          <w:tbl>
-            <w:tblPr>
-              <w:tblW w:w="0" w:type="auto"/>
-              <w:tblCellSpacing w:w="15" w:type="dxa"/>
-              <w:tblCellMar>
-                <w:top w:w="15" w:type="dxa"/>
-                <w:left w:w="15" w:type="dxa"/>
-                <w:bottom w:w="15" w:type="dxa"/>
-                <w:right w:w="15" w:type="dxa"/>
-              </w:tblCellMar>
-              <w:tblLook w:val="04A0" w:firstRow="1" w:lastRow="0" w:firstColumn="1" w:lastColumn="0" w:noHBand="0" w:noVBand="1"/>
-            </w:tblPr>
-            <w:tblGrid>
-              <w:gridCol w:w="81"/>
-              <w:gridCol w:w="2314"/>
-            </w:tblGrid>
-            <w:tr>
-              <w:trPr>
-                <w:tblCellSpacing w:w="15" w:type="dxa"/>
-              </w:trPr>
-              <w:tc>
-                <w:tcPr>
-                  <w:tcW w:w="0" w:type="auto"/>
-                  <w:vAlign w:val="center"/>
-                  <w:hideMark/>
-                </w:tcPr>
-                <w:p>
-                  <w:pPr>
-                    <w:pStyle w:val="w6asjqtextbase"/>
-                  </w:pPr>
-                </w:p>
-              </w:tc>
-              <w:tc>
-                <w:tcPr>
-                  <w:tcW w:w="0" w:type="auto"/>
-                  <w:vAlign w:val="center"/>
-                  <w:hideMark/>
-                </w:tcPr>
-                <w:p>
-                  <w:pPr>
-                    <w:pStyle w:val="w6asjqtextbase"/>
-                  </w:pPr>
-                  <w:r>
-                    <w:t>Endereços cadastrados.</w:t>
-                  </w:r>
-                </w:p>
-              </w:tc>
-            </w:tr>
-          </w:tbl>
-          <w:p/>
-        </w:tc>
-      </w:tr>
-      <w:tr>
-        <w:trPr>
-          <w:trHeight w:val="427"/>
-        </w:trPr>
-        <w:tc>
-          <w:tcPr>
-            <w:tcW w:w="4466" w:type="dxa"/>
-          </w:tcPr>
-          <w:tbl>
-            <w:tblPr>
-              <w:tblW w:w="0" w:type="auto"/>
-              <w:tblCellSpacing w:w="15" w:type="dxa"/>
-              <w:tblCellMar>
-                <w:top w:w="15" w:type="dxa"/>
-                <w:left w:w="15" w:type="dxa"/>
-                <w:bottom w:w="15" w:type="dxa"/>
-                <w:right w:w="15" w:type="dxa"/>
-              </w:tblCellMar>
-              <w:tblLook w:val="04A0" w:firstRow="1" w:lastRow="0" w:firstColumn="1" w:lastColumn="0" w:noHBand="0" w:noVBand="1"/>
-            </w:tblPr>
-            <w:tblGrid>
-              <w:gridCol w:w="1276"/>
-              <w:gridCol w:w="81"/>
-            </w:tblGrid>
-            <w:tr>
-              <w:trPr>
-                <w:tblCellSpacing w:w="15" w:type="dxa"/>
-              </w:trPr>
-              <w:tc>
-                <w:tcPr>
-                  <w:tcW w:w="0" w:type="auto"/>
-                  <w:vAlign w:val="center"/>
-                  <w:hideMark/>
-                </w:tcPr>
-                <w:p>
-                  <w:pPr>
-                    <w:pStyle w:val="w6asjqtextbase"/>
-                  </w:pPr>
-                  <w:r>
-                    <w:rPr>
-                      <w:rStyle w:val="CdigoHTML"/>
-                    </w:rPr>
-                    <w:t>motoristas</w:t>
-                  </w:r>
-                </w:p>
-              </w:tc>
-              <w:tc>
-                <w:tcPr>
-                  <w:tcW w:w="0" w:type="auto"/>
-                  <w:vAlign w:val="center"/>
-                  <w:hideMark/>
-                </w:tcPr>
-                <w:p>
-                  <w:pPr>
-                    <w:pStyle w:val="w6asjqtextbase"/>
-                  </w:pPr>
-                </w:p>
-              </w:tc>
-            </w:tr>
-          </w:tbl>
-          <w:p/>
-        </w:tc>
-        <w:tc>
-          <w:tcPr>
-            <w:tcW w:w="4626" w:type="dxa"/>
-          </w:tcPr>
-          <w:tbl>
-            <w:tblPr>
-              <w:tblW w:w="0" w:type="auto"/>
-              <w:tblCellSpacing w:w="15" w:type="dxa"/>
-              <w:tblCellMar>
-                <w:top w:w="15" w:type="dxa"/>
-                <w:left w:w="15" w:type="dxa"/>
-                <w:bottom w:w="15" w:type="dxa"/>
-                <w:right w:w="15" w:type="dxa"/>
-              </w:tblCellMar>
-              <w:tblLook w:val="04A0" w:firstRow="1" w:lastRow="0" w:firstColumn="1" w:lastColumn="0" w:noHBand="0" w:noVBand="1"/>
-            </w:tblPr>
-            <w:tblGrid>
-              <w:gridCol w:w="81"/>
-              <w:gridCol w:w="3475"/>
-            </w:tblGrid>
-            <w:tr>
-              <w:trPr>
-                <w:tblCellSpacing w:w="15" w:type="dxa"/>
-              </w:trPr>
-              <w:tc>
-                <w:tcPr>
-                  <w:tcW w:w="0" w:type="auto"/>
-                  <w:vAlign w:val="center"/>
-                  <w:hideMark/>
-                </w:tcPr>
-                <w:p>
-                  <w:pPr>
-                    <w:pStyle w:val="w6asjqtextbase"/>
-                  </w:pPr>
-                </w:p>
-              </w:tc>
-              <w:tc>
-                <w:tcPr>
-                  <w:tcW w:w="0" w:type="auto"/>
-                  <w:vAlign w:val="center"/>
-                  <w:hideMark/>
-                </w:tcPr>
-                <w:p>
-                  <w:pPr>
-                    <w:pStyle w:val="w6asjqtextbase"/>
-                  </w:pPr>
-                  <w:r>
-                    <w:t>Dados operacionais dos motoristas.</w:t>
-                  </w:r>
-                </w:p>
-              </w:tc>
-            </w:tr>
-          </w:tbl>
-          <w:p/>
-        </w:tc>
-      </w:tr>
-      <w:tr>
-        <w:trPr>
-          <w:trHeight w:val="427"/>
-        </w:trPr>
-        <w:tc>
-          <w:tcPr>
-            <w:tcW w:w="4466" w:type="dxa"/>
-          </w:tcPr>
-          <w:tbl>
-            <w:tblPr>
-              <w:tblW w:w="0" w:type="auto"/>
-              <w:tblCellSpacing w:w="15" w:type="dxa"/>
-              <w:tblCellMar>
-                <w:top w:w="15" w:type="dxa"/>
-                <w:left w:w="15" w:type="dxa"/>
-                <w:bottom w:w="15" w:type="dxa"/>
-                <w:right w:w="15" w:type="dxa"/>
-              </w:tblCellMar>
-              <w:tblLook w:val="04A0" w:firstRow="1" w:lastRow="0" w:firstColumn="1" w:lastColumn="0" w:noHBand="0" w:noVBand="1"/>
-            </w:tblPr>
-            <w:tblGrid>
-              <w:gridCol w:w="1051"/>
-            </w:tblGrid>
-            <w:tr>
-              <w:trPr>
-                <w:tblCellSpacing w:w="15" w:type="dxa"/>
-              </w:trPr>
-              <w:tc>
-                <w:tcPr>
-                  <w:tcW w:w="0" w:type="auto"/>
-                  <w:vAlign w:val="center"/>
-                  <w:hideMark/>
-                </w:tcPr>
-                <w:p>
-                  <w:pPr>
-                    <w:pStyle w:val="w6asjqtextbase"/>
-                  </w:pPr>
-                  <w:proofErr w:type="spellStart"/>
-                  <w:r>
-                    <w:rPr>
-                      <w:rStyle w:val="CdigoHTML"/>
-                    </w:rPr>
-                    <w:t>veiculos</w:t>
-                  </w:r>
-                  <w:proofErr w:type="spellEnd"/>
-                </w:p>
-              </w:tc>
-            </w:tr>
-          </w:tbl>
-          <w:p/>
-        </w:tc>
-        <w:tc>
-          <w:tcPr>
-            <w:tcW w:w="4626" w:type="dxa"/>
-          </w:tcPr>
-          <w:tbl>
-            <w:tblPr>
-              <w:tblW w:w="0" w:type="auto"/>
-              <w:tblCellSpacing w:w="15" w:type="dxa"/>
-              <w:tblCellMar>
-                <w:top w:w="15" w:type="dxa"/>
-                <w:left w:w="15" w:type="dxa"/>
-                <w:bottom w:w="15" w:type="dxa"/>
-                <w:right w:w="15" w:type="dxa"/>
-              </w:tblCellMar>
-              <w:tblLook w:val="04A0" w:firstRow="1" w:lastRow="0" w:firstColumn="1" w:lastColumn="0" w:noHBand="0" w:noVBand="1"/>
-            </w:tblPr>
-            <w:tblGrid>
-              <w:gridCol w:w="81"/>
-              <w:gridCol w:w="2375"/>
-            </w:tblGrid>
-            <w:tr>
-              <w:trPr>
-                <w:tblCellSpacing w:w="15" w:type="dxa"/>
-              </w:trPr>
-              <w:tc>
-                <w:tcPr>
-                  <w:tcW w:w="0" w:type="auto"/>
-                  <w:vAlign w:val="center"/>
-                  <w:hideMark/>
-                </w:tcPr>
-                <w:p>
-                  <w:pPr>
-                    <w:pStyle w:val="w6asjqtextbase"/>
-                  </w:pPr>
-                </w:p>
-              </w:tc>
-              <w:tc>
-                <w:tcPr>
-                  <w:tcW w:w="0" w:type="auto"/>
-                  <w:vAlign w:val="center"/>
-                  <w:hideMark/>
-                </w:tcPr>
-                <w:p>
-                  <w:pPr>
-                    <w:pStyle w:val="w6asjqtextbase"/>
-                  </w:pPr>
-                  <w:r>
-                    <w:t>Frota da transportadora.</w:t>
-                  </w:r>
-                </w:p>
-              </w:tc>
-            </w:tr>
-          </w:tbl>
-          <w:p/>
-        </w:tc>
-      </w:tr>
-      <w:tr>
-        <w:trPr>
-          <w:trHeight w:val="427"/>
-        </w:trPr>
-        <w:tc>
-          <w:tcPr>
-            <w:tcW w:w="4466" w:type="dxa"/>
-          </w:tcPr>
-          <w:tbl>
-            <w:tblPr>
-              <w:tblW w:w="0" w:type="auto"/>
-              <w:tblCellSpacing w:w="15" w:type="dxa"/>
-              <w:tblCellMar>
-                <w:top w:w="15" w:type="dxa"/>
-                <w:left w:w="15" w:type="dxa"/>
-                <w:bottom w:w="15" w:type="dxa"/>
-                <w:right w:w="15" w:type="dxa"/>
-              </w:tblCellMar>
-              <w:tblLook w:val="04A0" w:firstRow="1" w:lastRow="0" w:firstColumn="1" w:lastColumn="0" w:noHBand="0" w:noVBand="1"/>
-            </w:tblPr>
-            <w:tblGrid>
-              <w:gridCol w:w="1036"/>
-              <w:gridCol w:w="81"/>
-            </w:tblGrid>
-            <w:tr>
-              <w:trPr>
-                <w:tblCellSpacing w:w="15" w:type="dxa"/>
-              </w:trPr>
-              <w:tc>
-                <w:tcPr>
-                  <w:tcW w:w="0" w:type="auto"/>
-                  <w:vAlign w:val="center"/>
-                  <w:hideMark/>
-                </w:tcPr>
-                <w:p>
-                  <w:pPr>
-                    <w:pStyle w:val="w6asjqtextbase"/>
-                  </w:pPr>
-                  <w:r>
-                    <w:rPr>
-                      <w:rStyle w:val="CdigoHTML"/>
-                    </w:rPr>
-                    <w:t>remessas</w:t>
-                  </w:r>
-                </w:p>
-              </w:tc>
-              <w:tc>
-                <w:tcPr>
-                  <w:tcW w:w="0" w:type="auto"/>
-                  <w:vAlign w:val="center"/>
-                  <w:hideMark/>
-                </w:tcPr>
-                <w:p>
-                  <w:pPr>
-                    <w:pStyle w:val="w6asjqtextbase"/>
-                  </w:pPr>
-                </w:p>
-              </w:tc>
-            </w:tr>
-          </w:tbl>
-          <w:p/>
-        </w:tc>
-        <w:tc>
-          <w:tcPr>
-            <w:tcW w:w="4626" w:type="dxa"/>
-          </w:tcPr>
-          <w:tbl>
-            <w:tblPr>
-              <w:tblW w:w="0" w:type="auto"/>
-              <w:tblCellSpacing w:w="15" w:type="dxa"/>
-              <w:tblCellMar>
-                <w:top w:w="15" w:type="dxa"/>
-                <w:left w:w="15" w:type="dxa"/>
-                <w:bottom w:w="15" w:type="dxa"/>
-                <w:right w:w="15" w:type="dxa"/>
-              </w:tblCellMar>
-              <w:tblLook w:val="04A0" w:firstRow="1" w:lastRow="0" w:firstColumn="1" w:lastColumn="0" w:noHBand="0" w:noVBand="1"/>
-            </w:tblPr>
-            <w:tblGrid>
-              <w:gridCol w:w="81"/>
-              <w:gridCol w:w="4329"/>
-            </w:tblGrid>
-            <w:tr>
-              <w:trPr>
-                <w:tblCellSpacing w:w="15" w:type="dxa"/>
-              </w:trPr>
-              <w:tc>
-                <w:tcPr>
-                  <w:tcW w:w="0" w:type="auto"/>
-                  <w:vAlign w:val="center"/>
-                  <w:hideMark/>
-                </w:tcPr>
-                <w:p>
-                  <w:pPr>
-                    <w:pStyle w:val="w6asjqtextbase"/>
-                  </w:pPr>
-                </w:p>
-              </w:tc>
-              <w:tc>
-                <w:tcPr>
-                  <w:tcW w:w="0" w:type="auto"/>
-                  <w:vAlign w:val="center"/>
-                  <w:hideMark/>
-                </w:tcPr>
-                <w:p>
-                  <w:pPr>
-                    <w:pStyle w:val="w6asjqtextbase"/>
-                  </w:pPr>
-                  <w:r>
-                    <w:t>Contratações de transporte e dados gerais da carga.</w:t>
-                  </w:r>
-                </w:p>
-              </w:tc>
-            </w:tr>
-          </w:tbl>
-          <w:p/>
-        </w:tc>
-      </w:tr>
-      <w:tr>
-        <w:trPr>
-          <w:trHeight w:val="427"/>
-        </w:trPr>
-        <w:tc>
-          <w:tcPr>
-            <w:tcW w:w="4466" w:type="dxa"/>
-          </w:tcPr>
-          <w:tbl>
-            <w:tblPr>
-              <w:tblW w:w="0" w:type="auto"/>
-              <w:tblCellSpacing w:w="15" w:type="dxa"/>
-              <w:tblCellMar>
-                <w:top w:w="15" w:type="dxa"/>
-                <w:left w:w="15" w:type="dxa"/>
-                <w:bottom w:w="15" w:type="dxa"/>
-                <w:right w:w="15" w:type="dxa"/>
-              </w:tblCellMar>
-              <w:tblLook w:val="04A0" w:firstRow="1" w:lastRow="0" w:firstColumn="1" w:lastColumn="0" w:noHBand="0" w:noVBand="1"/>
-            </w:tblPr>
-            <w:tblGrid>
-              <w:gridCol w:w="916"/>
-              <w:gridCol w:w="81"/>
-            </w:tblGrid>
-            <w:tr>
-              <w:trPr>
-                <w:tblCellSpacing w:w="15" w:type="dxa"/>
-              </w:trPr>
-              <w:tc>
-                <w:tcPr>
-                  <w:tcW w:w="0" w:type="auto"/>
-                  <w:vAlign w:val="center"/>
-                  <w:hideMark/>
-                </w:tcPr>
-                <w:p>
-                  <w:pPr>
-                    <w:pStyle w:val="w6asjqtextbase"/>
-                  </w:pPr>
-                  <w:r>
-                    <w:rPr>
-                      <w:rStyle w:val="CdigoHTML"/>
-                    </w:rPr>
-                    <w:t>volumes</w:t>
-                  </w:r>
-                </w:p>
-              </w:tc>
-              <w:tc>
-                <w:tcPr>
-                  <w:tcW w:w="0" w:type="auto"/>
-                  <w:vAlign w:val="center"/>
-                  <w:hideMark/>
-                </w:tcPr>
-                <w:p>
-                  <w:pPr>
-                    <w:pStyle w:val="w6asjqtextbase"/>
-                  </w:pPr>
-                </w:p>
-              </w:tc>
-            </w:tr>
-          </w:tbl>
-          <w:p/>
-        </w:tc>
-        <w:tc>
-          <w:tcPr>
-            <w:tcW w:w="4626" w:type="dxa"/>
-          </w:tcPr>
-          <w:tbl>
-            <w:tblPr>
-              <w:tblW w:w="0" w:type="auto"/>
-              <w:tblCellSpacing w:w="15" w:type="dxa"/>
-              <w:tblCellMar>
-                <w:top w:w="15" w:type="dxa"/>
-                <w:left w:w="15" w:type="dxa"/>
-                <w:bottom w:w="15" w:type="dxa"/>
-                <w:right w:w="15" w:type="dxa"/>
-              </w:tblCellMar>
-              <w:tblLook w:val="04A0" w:firstRow="1" w:lastRow="0" w:firstColumn="1" w:lastColumn="0" w:noHBand="0" w:noVBand="1"/>
-            </w:tblPr>
-            <w:tblGrid>
-              <w:gridCol w:w="81"/>
-              <w:gridCol w:w="4329"/>
-            </w:tblGrid>
-            <w:tr>
-              <w:trPr>
-                <w:tblCellSpacing w:w="15" w:type="dxa"/>
-              </w:trPr>
-              <w:tc>
-                <w:tcPr>
-                  <w:tcW w:w="0" w:type="auto"/>
-                  <w:vAlign w:val="center"/>
-                  <w:hideMark/>
-                </w:tcPr>
-                <w:p>
-                  <w:pPr>
-                    <w:pStyle w:val="w6asjqtextbase"/>
-                  </w:pPr>
-                </w:p>
-              </w:tc>
-              <w:tc>
-                <w:tcPr>
-                  <w:tcW w:w="0" w:type="auto"/>
-                  <w:vAlign w:val="center"/>
-                  <w:hideMark/>
-                </w:tcPr>
-                <w:p>
-                  <w:pPr>
-                    <w:pStyle w:val="w6asjqtextbase"/>
-                  </w:pPr>
-                  <w:r>
-                    <w:t>Caixas, embalagens e unidades físicas transportadas.</w:t>
-                  </w:r>
-                </w:p>
-              </w:tc>
-            </w:tr>
-          </w:tbl>
-          <w:p/>
-        </w:tc>
-      </w:tr>
-      <w:tr>
-        <w:trPr>
-          <w:trHeight w:val="427"/>
-        </w:trPr>
-        <w:tc>
-          <w:tcPr>
-            <w:tcW w:w="4466" w:type="dxa"/>
-          </w:tcPr>
-          <w:tbl>
-            <w:tblPr>
-              <w:tblW w:w="0" w:type="auto"/>
-              <w:tblCellSpacing w:w="15" w:type="dxa"/>
-              <w:tblCellMar>
-                <w:top w:w="15" w:type="dxa"/>
-                <w:left w:w="15" w:type="dxa"/>
-                <w:bottom w:w="15" w:type="dxa"/>
-                <w:right w:w="15" w:type="dxa"/>
-              </w:tblCellMar>
-              <w:tblLook w:val="04A0" w:firstRow="1" w:lastRow="0" w:firstColumn="1" w:lastColumn="0" w:noHBand="0" w:noVBand="1"/>
-            </w:tblPr>
-            <w:tblGrid>
-              <w:gridCol w:w="1636"/>
-              <w:gridCol w:w="81"/>
-            </w:tblGrid>
-            <w:tr>
-              <w:trPr>
-                <w:tblCellSpacing w:w="15" w:type="dxa"/>
-              </w:trPr>
-              <w:tc>
-                <w:tcPr>
-                  <w:tcW w:w="0" w:type="auto"/>
-                  <w:vAlign w:val="center"/>
-                  <w:hideMark/>
-                </w:tcPr>
-                <w:p>
-                  <w:pPr>
-                    <w:pStyle w:val="w6asjqtextbase"/>
-                  </w:pPr>
-                  <w:proofErr w:type="spellStart"/>
-                  <w:r>
-                    <w:rPr>
-                      <w:rStyle w:val="CdigoHTML"/>
-                    </w:rPr>
-                    <w:t>itens_remessa</w:t>
-                  </w:r>
-                  <w:proofErr w:type="spellEnd"/>
-                </w:p>
-              </w:tc>
-              <w:tc>
-                <w:tcPr>
-                  <w:tcW w:w="0" w:type="auto"/>
-                  <w:vAlign w:val="center"/>
-                  <w:hideMark/>
-                </w:tcPr>
-                <w:p>
-                  <w:pPr>
-                    <w:pStyle w:val="w6asjqtextbase"/>
-                  </w:pPr>
-                </w:p>
-              </w:tc>
-            </w:tr>
-          </w:tbl>
-          <w:p/>
-        </w:tc>
-        <w:tc>
-          <w:tcPr>
-            <w:tcW w:w="4626" w:type="dxa"/>
-          </w:tcPr>
-          <w:tbl>
-            <w:tblPr>
-              <w:tblW w:w="0" w:type="auto"/>
-              <w:tblCellSpacing w:w="15" w:type="dxa"/>
-              <w:tblCellMar>
-                <w:top w:w="15" w:type="dxa"/>
-                <w:left w:w="15" w:type="dxa"/>
-                <w:bottom w:w="15" w:type="dxa"/>
-                <w:right w:w="15" w:type="dxa"/>
-              </w:tblCellMar>
-              <w:tblLook w:val="04A0" w:firstRow="1" w:lastRow="0" w:firstColumn="1" w:lastColumn="0" w:noHBand="0" w:noVBand="1"/>
-            </w:tblPr>
-            <w:tblGrid>
-              <w:gridCol w:w="81"/>
-              <w:gridCol w:w="4329"/>
-            </w:tblGrid>
-            <w:tr>
-              <w:trPr>
-                <w:tblCellSpacing w:w="15" w:type="dxa"/>
-              </w:trPr>
-              <w:tc>
-                <w:tcPr>
-                  <w:tcW w:w="0" w:type="auto"/>
-                  <w:vAlign w:val="center"/>
-                  <w:hideMark/>
-                </w:tcPr>
-                <w:p>
-                  <w:pPr>
-                    <w:pStyle w:val="w6asjqtextbase"/>
-                  </w:pPr>
-                </w:p>
-              </w:tc>
-              <w:tc>
-                <w:tcPr>
-                  <w:tcW w:w="0" w:type="auto"/>
-                  <w:vAlign w:val="center"/>
-                  <w:hideMark/>
-                </w:tcPr>
-                <w:p>
-                  <w:pPr>
-                    <w:pStyle w:val="w6asjqtextbase"/>
-                  </w:pPr>
-                  <w:r>
-                    <w:t>Descrição e quantidade das mercadorias de cada remessa.</w:t>
-                  </w:r>
-                </w:p>
-              </w:tc>
-            </w:tr>
-          </w:tbl>
-          <w:p/>
-        </w:tc>
-      </w:tr>
-      <w:tr>
-        <w:trPr>
-          <w:trHeight w:val="427"/>
-        </w:trPr>
-        <w:tc>
-          <w:tcPr>
-            <w:tcW w:w="4466" w:type="dxa"/>
-          </w:tcPr>
-          <w:tbl>
-            <w:tblPr>
-              <w:tblW w:w="0" w:type="auto"/>
-              <w:tblCellSpacing w:w="15" w:type="dxa"/>
-              <w:tblCellMar>
-                <w:top w:w="15" w:type="dxa"/>
-                <w:left w:w="15" w:type="dxa"/>
-                <w:bottom w:w="15" w:type="dxa"/>
-                <w:right w:w="15" w:type="dxa"/>
-              </w:tblCellMar>
-              <w:tblLook w:val="04A0" w:firstRow="1" w:lastRow="0" w:firstColumn="1" w:lastColumn="0" w:noHBand="0" w:noVBand="1"/>
-            </w:tblPr>
-            <w:tblGrid>
-              <w:gridCol w:w="81"/>
-              <w:gridCol w:w="81"/>
-            </w:tblGrid>
-            <w:tr>
-              <w:trPr>
-                <w:tblCellSpacing w:w="15" w:type="dxa"/>
-              </w:trPr>
-              <w:tc>
-                <w:tcPr>
-                  <w:tcW w:w="0" w:type="auto"/>
-                  <w:vAlign w:val="center"/>
-                  <w:hideMark/>
-                </w:tcPr>
-                <w:p>
-                  <w:pPr>
-                    <w:pStyle w:val="w6asjqtextbase"/>
-                  </w:pPr>
-                </w:p>
-              </w:tc>
-              <w:tc>
-                <w:tcPr>
-                  <w:tcW w:w="0" w:type="auto"/>
-                  <w:vAlign w:val="center"/>
-                  <w:hideMark/>
-                </w:tcPr>
-                <w:p>
-                  <w:pPr>
-                    <w:pStyle w:val="w6asjqtextbase"/>
-                  </w:pPr>
-                </w:p>
-              </w:tc>
-            </w:tr>
-          </w:tbl>
-          <w:p>
-            <w:r>
-              <w:t>coletas</w:t>
-            </w:r>
-          </w:p>
-        </w:tc>
-        <w:tc>
-          <w:tcPr>
-            <w:tcW w:w="4626" w:type="dxa"/>
-          </w:tcPr>
-          <w:tbl>
-            <w:tblPr>
-              <w:tblW w:w="0" w:type="auto"/>
-              <w:tblCellSpacing w:w="15" w:type="dxa"/>
-              <w:tblCellMar>
-                <w:top w:w="15" w:type="dxa"/>
-                <w:left w:w="15" w:type="dxa"/>
-                <w:bottom w:w="15" w:type="dxa"/>
-                <w:right w:w="15" w:type="dxa"/>
-              </w:tblCellMar>
-              <w:tblLook w:val="04A0" w:firstRow="1" w:lastRow="0" w:firstColumn="1" w:lastColumn="0" w:noHBand="0" w:noVBand="1"/>
-            </w:tblPr>
-            <w:tblGrid>
-              <w:gridCol w:w="81"/>
-              <w:gridCol w:w="3847"/>
-            </w:tblGrid>
-            <w:tr>
-              <w:trPr>
-                <w:tblCellSpacing w:w="15" w:type="dxa"/>
-              </w:trPr>
-              <w:tc>
-                <w:tcPr>
-                  <w:tcW w:w="0" w:type="auto"/>
-                  <w:vAlign w:val="center"/>
-                  <w:hideMark/>
-                </w:tcPr>
-                <w:p>
-                  <w:pPr>
-                    <w:pStyle w:val="w6asjqtextbase"/>
-                  </w:pPr>
-                </w:p>
-              </w:tc>
-              <w:tc>
-                <w:tcPr>
-                  <w:tcW w:w="0" w:type="auto"/>
-                  <w:vAlign w:val="center"/>
-                  <w:hideMark/>
-                </w:tcPr>
-                <w:p>
-                  <w:pPr>
-                    <w:pStyle w:val="w6asjqtextbase"/>
-                  </w:pPr>
-                  <w:r>
-                    <w:t xml:space="preserve"> </w:t>
-                  </w:r>
-                  <w:r>
-                    <w:t>Agendamento e realização das coletas.</w:t>
-                  </w:r>
-                </w:p>
-              </w:tc>
-            </w:tr>
-          </w:tbl>
-          <w:p/>
-        </w:tc>
-      </w:tr>
-      <w:tr>
-        <w:trPr>
-          <w:trHeight w:val="427"/>
-        </w:trPr>
-        <w:tc>
-          <w:tcPr>
-            <w:tcW w:w="4466" w:type="dxa"/>
-          </w:tcPr>
-          <w:tbl>
-            <w:tblPr>
-              <w:tblW w:w="0" w:type="auto"/>
-              <w:tblCellSpacing w:w="15" w:type="dxa"/>
-              <w:tblCellMar>
-                <w:top w:w="15" w:type="dxa"/>
-                <w:left w:w="15" w:type="dxa"/>
-                <w:bottom w:w="15" w:type="dxa"/>
-                <w:right w:w="15" w:type="dxa"/>
-              </w:tblCellMar>
-              <w:tblLook w:val="04A0" w:firstRow="1" w:lastRow="0" w:firstColumn="1" w:lastColumn="0" w:noHBand="0" w:noVBand="1"/>
-            </w:tblPr>
-            <w:tblGrid>
-              <w:gridCol w:w="916"/>
-              <w:gridCol w:w="81"/>
-            </w:tblGrid>
-            <w:tr>
-              <w:trPr>
-                <w:tblCellSpacing w:w="15" w:type="dxa"/>
-              </w:trPr>
-              <w:tc>
-                <w:tcPr>
-                  <w:tcW w:w="0" w:type="auto"/>
-                  <w:vAlign w:val="center"/>
-                  <w:hideMark/>
-                </w:tcPr>
-                <w:p>
-                  <w:pPr>
-                    <w:pStyle w:val="w6asjqtextbase"/>
-                  </w:pPr>
-                  <w:r>
-                    <w:rPr>
-                      <w:rStyle w:val="CdigoHTML"/>
-                    </w:rPr>
-                    <w:lastRenderedPageBreak/>
-                    <w:t>viagens</w:t>
-                  </w:r>
-                </w:p>
-              </w:tc>
-              <w:tc>
-                <w:tcPr>
-                  <w:tcW w:w="0" w:type="auto"/>
-                  <w:vAlign w:val="center"/>
-                  <w:hideMark/>
-                </w:tcPr>
-                <w:p>
-                  <w:pPr>
-                    <w:pStyle w:val="w6asjqtextbase"/>
-                  </w:pPr>
-                </w:p>
-              </w:tc>
-            </w:tr>
-          </w:tbl>
-          <w:p/>
-        </w:tc>
-        <w:tc>
-          <w:tcPr>
-            <w:tcW w:w="4626" w:type="dxa"/>
-          </w:tcPr>
-          <w:tbl>
-            <w:tblPr>
-              <w:tblW w:w="0" w:type="auto"/>
-              <w:tblCellSpacing w:w="15" w:type="dxa"/>
-              <w:tblCellMar>
-                <w:top w:w="15" w:type="dxa"/>
-                <w:left w:w="15" w:type="dxa"/>
-                <w:bottom w:w="15" w:type="dxa"/>
-                <w:right w:w="15" w:type="dxa"/>
-              </w:tblCellMar>
-              <w:tblLook w:val="04A0" w:firstRow="1" w:lastRow="0" w:firstColumn="1" w:lastColumn="0" w:noHBand="0" w:noVBand="1"/>
-            </w:tblPr>
-            <w:tblGrid>
-              <w:gridCol w:w="81"/>
-              <w:gridCol w:w="3988"/>
-            </w:tblGrid>
-            <w:tr>
-              <w:trPr>
-                <w:tblCellSpacing w:w="15" w:type="dxa"/>
-              </w:trPr>
-              <w:tc>
-                <w:tcPr>
-                  <w:tcW w:w="0" w:type="auto"/>
-                  <w:vAlign w:val="center"/>
-                  <w:hideMark/>
-                </w:tcPr>
-                <w:p>
-                  <w:pPr>
-                    <w:pStyle w:val="w6asjqtextbase"/>
-                  </w:pPr>
-                </w:p>
-              </w:tc>
-              <w:tc>
-                <w:tcPr>
-                  <w:tcW w:w="0" w:type="auto"/>
-                  <w:vAlign w:val="center"/>
-                  <w:hideMark/>
-                </w:tcPr>
-                <w:p>
-                  <w:pPr>
-                    <w:pStyle w:val="w6asjqtextbase"/>
-                  </w:pPr>
-                  <w:r>
-                    <w:t>Execução de um deslocamento logístico.</w:t>
-                  </w:r>
-                </w:p>
-              </w:tc>
-            </w:tr>
-          </w:tbl>
-          <w:p/>
-        </w:tc>
-      </w:tr>
-      <w:tr>
-        <w:trPr>
-          <w:trHeight w:val="427"/>
-        </w:trPr>
-        <w:tc>
-          <w:tcPr>
-            <w:tcW w:w="4466" w:type="dxa"/>
-          </w:tcPr>
-          <w:tbl>
-            <w:tblPr>
-              <w:tblW w:w="0" w:type="auto"/>
-              <w:tblCellSpacing w:w="15" w:type="dxa"/>
-              <w:tblCellMar>
-                <w:top w:w="15" w:type="dxa"/>
-                <w:left w:w="15" w:type="dxa"/>
-                <w:bottom w:w="15" w:type="dxa"/>
-                <w:right w:w="15" w:type="dxa"/>
-              </w:tblCellMar>
-              <w:tblLook w:val="04A0" w:firstRow="1" w:lastRow="0" w:firstColumn="1" w:lastColumn="0" w:noHBand="0" w:noVBand="1"/>
-            </w:tblPr>
-            <w:tblGrid>
-              <w:gridCol w:w="1771"/>
-            </w:tblGrid>
-            <w:tr>
-              <w:trPr>
-                <w:tblCellSpacing w:w="15" w:type="dxa"/>
-              </w:trPr>
-              <w:tc>
-                <w:tcPr>
-                  <w:tcW w:w="0" w:type="auto"/>
-                  <w:vAlign w:val="center"/>
-                  <w:hideMark/>
-                </w:tcPr>
-                <w:p>
-                  <w:pPr>
-                    <w:pStyle w:val="w6asjqtextbase"/>
-                  </w:pPr>
-                  <w:proofErr w:type="spellStart"/>
-                  <w:r>
-                    <w:rPr>
-                      <w:rStyle w:val="CdigoHTML"/>
-                    </w:rPr>
-                    <w:t>paradas_viagem</w:t>
-                  </w:r>
-                  <w:proofErr w:type="spellEnd"/>
-                </w:p>
-              </w:tc>
-            </w:tr>
-          </w:tbl>
-          <w:p/>
-        </w:tc>
-        <w:tc>
-          <w:tcPr>
-            <w:tcW w:w="4626" w:type="dxa"/>
-          </w:tcPr>
-          <w:tbl>
-            <w:tblPr>
-              <w:tblW w:w="0" w:type="auto"/>
-              <w:tblCellSpacing w:w="15" w:type="dxa"/>
-              <w:tblCellMar>
-                <w:top w:w="15" w:type="dxa"/>
-                <w:left w:w="15" w:type="dxa"/>
-                <w:bottom w:w="15" w:type="dxa"/>
-                <w:right w:w="15" w:type="dxa"/>
-              </w:tblCellMar>
-              <w:tblLook w:val="04A0" w:firstRow="1" w:lastRow="0" w:firstColumn="1" w:lastColumn="0" w:noHBand="0" w:noVBand="1"/>
-            </w:tblPr>
-            <w:tblGrid>
-              <w:gridCol w:w="81"/>
-              <w:gridCol w:w="4329"/>
-            </w:tblGrid>
-            <w:tr>
-              <w:trPr>
-                <w:tblCellSpacing w:w="15" w:type="dxa"/>
-              </w:trPr>
-              <w:tc>
-                <w:tcPr>
-                  <w:tcW w:w="0" w:type="auto"/>
-                  <w:vAlign w:val="center"/>
-                  <w:hideMark/>
-                </w:tcPr>
-                <w:p>
-                  <w:pPr>
-                    <w:pStyle w:val="w6asjqtextbase"/>
-                  </w:pPr>
-                </w:p>
-              </w:tc>
-              <w:tc>
-                <w:tcPr>
-                  <w:tcW w:w="0" w:type="auto"/>
-                  <w:vAlign w:val="center"/>
-                  <w:hideMark/>
-                </w:tcPr>
-                <w:p>
-                  <w:pPr>
-                    <w:pStyle w:val="w6asjqtextbase"/>
-                  </w:pPr>
-                  <w:r>
-                    <w:t>Sequência de locais visitados durante a viagem.</w:t>
-                  </w:r>
-                </w:p>
-              </w:tc>
-            </w:tr>
-          </w:tbl>
-          <w:p/>
-        </w:tc>
-      </w:tr>
-      <w:tr>
-        <w:trPr>
-          <w:trHeight w:val="427"/>
-        </w:trPr>
-        <w:tc>
-          <w:tcPr>
-            <w:tcW w:w="4466" w:type="dxa"/>
-          </w:tcPr>
-          <w:tbl>
-            <w:tblPr>
-              <w:tblW w:w="0" w:type="auto"/>
-              <w:tblCellSpacing w:w="15" w:type="dxa"/>
-              <w:tblCellMar>
-                <w:top w:w="15" w:type="dxa"/>
-                <w:left w:w="15" w:type="dxa"/>
-                <w:bottom w:w="15" w:type="dxa"/>
-                <w:right w:w="15" w:type="dxa"/>
-              </w:tblCellMar>
-              <w:tblLook w:val="04A0" w:firstRow="1" w:lastRow="0" w:firstColumn="1" w:lastColumn="0" w:noHBand="0" w:noVBand="1"/>
-            </w:tblPr>
-            <w:tblGrid>
-              <w:gridCol w:w="1876"/>
-              <w:gridCol w:w="81"/>
-            </w:tblGrid>
-            <w:tr>
-              <w:trPr>
-                <w:tblCellSpacing w:w="15" w:type="dxa"/>
-              </w:trPr>
-              <w:tc>
-                <w:tcPr>
-                  <w:tcW w:w="0" w:type="auto"/>
-                  <w:vAlign w:val="center"/>
-                  <w:hideMark/>
-                </w:tcPr>
-                <w:p>
-                  <w:pPr>
-                    <w:pStyle w:val="w6asjqtextbase"/>
-                  </w:pPr>
-                  <w:proofErr w:type="spellStart"/>
-                  <w:r>
-                    <w:rPr>
-                      <w:rStyle w:val="CdigoHTML"/>
-                    </w:rPr>
-                    <w:t>viagem_remessas</w:t>
-                  </w:r>
-                  <w:proofErr w:type="spellEnd"/>
-                </w:p>
-              </w:tc>
-              <w:tc>
-                <w:tcPr>
-                  <w:tcW w:w="0" w:type="auto"/>
-                  <w:vAlign w:val="center"/>
-                  <w:hideMark/>
-                </w:tcPr>
-                <w:p>
-                  <w:pPr>
-                    <w:pStyle w:val="w6asjqtextbase"/>
-                  </w:pPr>
-                </w:p>
-              </w:tc>
-            </w:tr>
-          </w:tbl>
-          <w:p/>
-        </w:tc>
-        <w:tc>
-          <w:tcPr>
-            <w:tcW w:w="4626" w:type="dxa"/>
-          </w:tcPr>
-          <w:tbl>
-            <w:tblPr>
-              <w:tblW w:w="0" w:type="auto"/>
-              <w:tblCellSpacing w:w="15" w:type="dxa"/>
-              <w:tblCellMar>
-                <w:top w:w="15" w:type="dxa"/>
-                <w:left w:w="15" w:type="dxa"/>
-                <w:bottom w:w="15" w:type="dxa"/>
-                <w:right w:w="15" w:type="dxa"/>
-              </w:tblCellMar>
-              <w:tblLook w:val="04A0" w:firstRow="1" w:lastRow="0" w:firstColumn="1" w:lastColumn="0" w:noHBand="0" w:noVBand="1"/>
-            </w:tblPr>
-            <w:tblGrid>
-              <w:gridCol w:w="81"/>
-              <w:gridCol w:w="3654"/>
-            </w:tblGrid>
-            <w:tr>
-              <w:trPr>
-                <w:tblCellSpacing w:w="15" w:type="dxa"/>
-              </w:trPr>
-              <w:tc>
-                <w:tcPr>
-                  <w:tcW w:w="0" w:type="auto"/>
-                  <w:vAlign w:val="center"/>
-                  <w:hideMark/>
-                </w:tcPr>
-                <w:p>
-                  <w:pPr>
-                    <w:pStyle w:val="w6asjqtextbase"/>
-                  </w:pPr>
-                </w:p>
-              </w:tc>
-              <w:tc>
-                <w:tcPr>
-                  <w:tcW w:w="0" w:type="auto"/>
-                  <w:vAlign w:val="center"/>
-                  <w:hideMark/>
-                </w:tcPr>
-                <w:p>
-                  <w:pPr>
-                    <w:pStyle w:val="w6asjqtextbase"/>
-                  </w:pPr>
-                  <w:r>
-                    <w:t>Associação entre viagens e remessas.</w:t>
-                  </w:r>
-                </w:p>
-              </w:tc>
-            </w:tr>
-          </w:tbl>
-          <w:p/>
-        </w:tc>
-      </w:tr>
-      <w:tr>
-        <w:trPr>
-          <w:trHeight w:val="427"/>
-        </w:trPr>
-        <w:tc>
-          <w:tcPr>
-            <w:tcW w:w="4466" w:type="dxa"/>
-          </w:tcPr>
-          <w:tbl>
-            <w:tblPr>
-              <w:tblW w:w="0" w:type="auto"/>
-              <w:tblCellSpacing w:w="15" w:type="dxa"/>
-              <w:tblCellMar>
-                <w:top w:w="15" w:type="dxa"/>
-                <w:left w:w="15" w:type="dxa"/>
-                <w:bottom w:w="15" w:type="dxa"/>
-                <w:right w:w="15" w:type="dxa"/>
-              </w:tblCellMar>
-              <w:tblLook w:val="04A0" w:firstRow="1" w:lastRow="0" w:firstColumn="1" w:lastColumn="0" w:noHBand="0" w:noVBand="1"/>
-            </w:tblPr>
-            <w:tblGrid>
-              <w:gridCol w:w="2476"/>
-              <w:gridCol w:w="81"/>
-            </w:tblGrid>
-            <w:tr>
-              <w:trPr>
-                <w:tblCellSpacing w:w="15" w:type="dxa"/>
-              </w:trPr>
-              <w:tc>
-                <w:tcPr>
-                  <w:tcW w:w="0" w:type="auto"/>
-                  <w:vAlign w:val="center"/>
-                  <w:hideMark/>
-                </w:tcPr>
-                <w:p>
-                  <w:pPr>
-                    <w:pStyle w:val="w6asjqtextbase"/>
-                  </w:pPr>
-                  <w:proofErr w:type="spellStart"/>
-                  <w:r>
-                    <w:rPr>
-                      <w:rStyle w:val="CdigoHTML"/>
-                    </w:rPr>
-                    <w:t>eventos_rastreamento</w:t>
-                  </w:r>
-                  <w:proofErr w:type="spellEnd"/>
-                </w:p>
-              </w:tc>
-              <w:tc>
-                <w:tcPr>
-                  <w:tcW w:w="0" w:type="auto"/>
-                  <w:vAlign w:val="center"/>
-                  <w:hideMark/>
-                </w:tcPr>
-                <w:p>
-                  <w:pPr>
-                    <w:pStyle w:val="w6asjqtextbase"/>
-                  </w:pPr>
-                </w:p>
-              </w:tc>
-            </w:tr>
-          </w:tbl>
-          <w:p/>
-        </w:tc>
-        <w:tc>
-          <w:tcPr>
-            <w:tcW w:w="4626" w:type="dxa"/>
-          </w:tcPr>
-          <w:tbl>
-            <w:tblPr>
-              <w:tblW w:w="4410" w:type="dxa"/>
-              <w:tblCellSpacing w:w="15" w:type="dxa"/>
-              <w:tblCellMar>
-                <w:top w:w="15" w:type="dxa"/>
-                <w:left w:w="15" w:type="dxa"/>
-                <w:bottom w:w="15" w:type="dxa"/>
-                <w:right w:w="15" w:type="dxa"/>
-              </w:tblCellMar>
-              <w:tblLook w:val="04A0" w:firstRow="1" w:lastRow="0" w:firstColumn="1" w:lastColumn="0" w:noHBand="0" w:noVBand="1"/>
-            </w:tblPr>
-            <w:tblGrid>
-              <w:gridCol w:w="636"/>
-              <w:gridCol w:w="3774"/>
-            </w:tblGrid>
-            <w:tr>
-              <w:trPr>
-                <w:tblCellSpacing w:w="15" w:type="dxa"/>
-              </w:trPr>
-              <w:tc>
-                <w:tcPr>
-                  <w:tcW w:w="591" w:type="dxa"/>
-                  <w:vAlign w:val="center"/>
-                  <w:hideMark/>
-                </w:tcPr>
-                <w:p>
-                  <w:pPr>
-                    <w:pStyle w:val="w6asjqtextbase"/>
-                  </w:pPr>
-                </w:p>
-              </w:tc>
-              <w:tc>
-                <w:tcPr>
-                  <w:tcW w:w="0" w:type="auto"/>
-                  <w:vAlign w:val="center"/>
-                  <w:hideMark/>
-                </w:tcPr>
-                <w:p>
-                  <w:pPr>
-                    <w:pStyle w:val="w6asjqtextbase"/>
-                  </w:pPr>
-                  <w:r>
-                    <w:t>Histórico de movimentação das remessas.</w:t>
-                  </w:r>
-                </w:p>
-              </w:tc>
-            </w:tr>
-          </w:tbl>
-          <w:p/>
-        </w:tc>
-      </w:tr>
-      <w:tr>
-        <w:trPr>
-          <w:trHeight w:val="427"/>
-        </w:trPr>
-        <w:tc>
-          <w:tcPr>
-            <w:tcW w:w="4466" w:type="dxa"/>
-          </w:tcPr>
-          <w:tbl>
-            <w:tblPr>
-              <w:tblW w:w="0" w:type="auto"/>
-              <w:tblCellSpacing w:w="15" w:type="dxa"/>
-              <w:tblCellMar>
-                <w:top w:w="15" w:type="dxa"/>
-                <w:left w:w="15" w:type="dxa"/>
-                <w:bottom w:w="15" w:type="dxa"/>
-                <w:right w:w="15" w:type="dxa"/>
-              </w:tblCellMar>
-              <w:tblLook w:val="04A0" w:firstRow="1" w:lastRow="0" w:firstColumn="1" w:lastColumn="0" w:noHBand="0" w:noVBand="1"/>
-            </w:tblPr>
-            <w:tblGrid>
-              <w:gridCol w:w="1036"/>
-              <w:gridCol w:w="81"/>
-            </w:tblGrid>
-            <w:tr>
-              <w:trPr>
-                <w:tblCellSpacing w:w="15" w:type="dxa"/>
-              </w:trPr>
-              <w:tc>
-                <w:tcPr>
-                  <w:tcW w:w="0" w:type="auto"/>
-                  <w:vAlign w:val="center"/>
-                  <w:hideMark/>
-                </w:tcPr>
-                <w:p>
-                  <w:pPr>
-                    <w:pStyle w:val="w6asjqtextbase"/>
-                  </w:pPr>
-                  <w:r>
-                    <w:rPr>
-                      <w:rStyle w:val="CdigoHTML"/>
-                    </w:rPr>
-                    <w:t>entregas</w:t>
-                  </w:r>
-                </w:p>
-              </w:tc>
-              <w:tc>
-                <w:tcPr>
-                  <w:tcW w:w="0" w:type="auto"/>
-                  <w:vAlign w:val="center"/>
-                  <w:hideMark/>
-                </w:tcPr>
-                <w:p>
-                  <w:pPr>
-                    <w:pStyle w:val="w6asjqtextbase"/>
-                  </w:pPr>
-                </w:p>
-              </w:tc>
-            </w:tr>
-          </w:tbl>
-          <w:p/>
-        </w:tc>
-        <w:tc>
-          <w:tcPr>
-            <w:tcW w:w="4626" w:type="dxa"/>
-          </w:tcPr>
-          <w:tbl>
-            <w:tblPr>
-              <w:tblW w:w="0" w:type="auto"/>
-              <w:tblCellSpacing w:w="15" w:type="dxa"/>
-              <w:tblCellMar>
-                <w:top w:w="15" w:type="dxa"/>
-                <w:left w:w="15" w:type="dxa"/>
-                <w:bottom w:w="15" w:type="dxa"/>
-                <w:right w:w="15" w:type="dxa"/>
-              </w:tblCellMar>
-              <w:tblLook w:val="04A0" w:firstRow="1" w:lastRow="0" w:firstColumn="1" w:lastColumn="0" w:noHBand="0" w:noVBand="1"/>
-            </w:tblPr>
-            <w:tblGrid>
-              <w:gridCol w:w="81"/>
-              <w:gridCol w:w="3581"/>
-            </w:tblGrid>
-            <w:tr>
-              <w:trPr>
-                <w:tblCellSpacing w:w="15" w:type="dxa"/>
-              </w:trPr>
-              <w:tc>
-                <w:tcPr>
-                  <w:tcW w:w="0" w:type="auto"/>
-                  <w:vAlign w:val="center"/>
-                  <w:hideMark/>
-                </w:tcPr>
-                <w:p>
-                  <w:pPr>
-                    <w:pStyle w:val="w6asjqtextbase"/>
-                  </w:pPr>
-                </w:p>
-              </w:tc>
-              <w:tc>
-                <w:tcPr>
-                  <w:tcW w:w="0" w:type="auto"/>
-                  <w:vAlign w:val="center"/>
-                  <w:hideMark/>
-                </w:tcPr>
-                <w:p>
-                  <w:pPr>
-                    <w:pStyle w:val="w6asjqtextbase"/>
-                  </w:pPr>
-                  <w:r>
-                    <w:t>Dados da conclusão de uma entrega.</w:t>
-                  </w:r>
-                </w:p>
-              </w:tc>
-            </w:tr>
-          </w:tbl>
-          <w:p/>
-        </w:tc>
-      </w:tr>
-      <w:tr>
-        <w:trPr>
-          <w:trHeight w:val="427"/>
-        </w:trPr>
-        <w:tc>
-          <w:tcPr>
-            <w:tcW w:w="4466" w:type="dxa"/>
-          </w:tcPr>
-          <w:p>
-            <w:proofErr w:type="spellStart"/>
-            <w:r>
-              <w:t>cotacoes_frete</w:t>
-            </w:r>
-            <w:proofErr w:type="spellEnd"/>
-          </w:p>
-        </w:tc>
-        <w:tc>
-          <w:tcPr>
-            <w:tcW w:w="4626" w:type="dxa"/>
-          </w:tcPr>
-          <w:p>
-            <w:r>
-              <w:t>Armazena cada simulação realizada e seu resultado.</w:t>
-            </w:r>
-          </w:p>
-        </w:tc>
-      </w:tr>
-      <w:tr>
-        <w:trPr>
-          <w:trHeight w:val="427"/>
-        </w:trPr>
-        <w:tc>
-          <w:tcPr>
-            <w:tcW w:w="4466" w:type="dxa"/>
-          </w:tcPr>
-          <w:p>
-            <w:proofErr w:type="spellStart"/>
-            <w:r>
-              <w:t>tarifas_frete</w:t>
-            </w:r>
-            <w:proofErr w:type="spellEnd"/>
-          </w:p>
-        </w:tc>
-        <w:tc>
-          <w:tcPr>
-            <w:tcW w:w="4626" w:type="dxa"/>
-          </w:tcPr>
-          <w:p>
-            <w:r>
-              <w:t>Armazena as regras utilizadas para calcular o preço.</w:t>
-            </w:r>
-          </w:p>
-        </w:tc>
-      </w:tr>
-    </w:tbl>
-    <w:p/>
     <w:p/>
     <w:p>
       <w:pPr>
@@ -2348,6 +384,7 @@
     </w:p>
     <w:p>
       <w:r>
+        <w:lastRenderedPageBreak/>
         <w:t>Uma caixa pode pesar pouco, mas ocupar bastante espaço dentro do veículo. Por isso, a transportadora pode cobrar pelo peso cubado em vez do peso real, quando ele for maior.</w:t>
       </w:r>
     </w:p>
@@ -2426,7 +463,6 @@
     </w:p>
     <w:p>
       <w:r>
-        <w:lastRenderedPageBreak/>
         <w:t>Onde:</w:t>
       </w:r>
     </w:p>
@@ -3126,7 +1162,6 @@
     </w:p>
     <w:p>
       <w:r>
-        <w:lastRenderedPageBreak/>
         <w:t xml:space="preserve">Valores </w:t>
       </w:r>
       <w:r>
@@ -3405,6 +1440,9 @@
             <m:t>+10</m:t>
           </m:r>
           <m:r>
+            <m:rPr>
+              <m:sty m:val="p"/>
+            </m:rPr>
             <w:br/>
           </m:r>
         </m:oMath>
@@ -3479,18 +1517,28 @@
           <w:u w:val="single"/>
         </w:rPr>
       </w:pPr>
-      <w:r>
+    </w:p>
+    <w:p>
+      <w:pPr>
         <w:rPr>
+          <w:sz w:val="36"/>
+          <w:szCs w:val="36"/>
+          <w:u w:val="single"/>
+        </w:rPr>
+      </w:pPr>
+      <w:r>
+        <w:rPr>
+          <w:noProof/>
           <w:sz w:val="36"/>
           <w:szCs w:val="36"/>
           <w:u w:val="single"/>
         </w:rPr>
         <w:lastRenderedPageBreak/>
         <w:drawing>
-          <wp:inline distT="0" distB="0" distL="0" distR="0" wp14:anchorId="3629E5E4" wp14:editId="7FB4D6F0">
-            <wp:extent cx="6236029" cy="5257800"/>
+          <wp:inline distT="0" distB="0" distL="0" distR="0" wp14:anchorId="01DD0648" wp14:editId="5D3499A3">
+            <wp:extent cx="5400040" cy="6267450"/>
             <wp:effectExtent l="0" t="0" r="0" b="0"/>
-            <wp:docPr id="276586682" name="Imagem 1"/>
+            <wp:docPr id="1733692462" name="Imagem 1"/>
             <wp:cNvGraphicFramePr>
               <a:graphicFrameLocks xmlns:a="http://schemas.openxmlformats.org/drawingml/2006/main" noChangeAspect="1"/>
             </wp:cNvGraphicFramePr>
@@ -3498,11 +1546,17 @@
               <a:graphicData uri="http://schemas.openxmlformats.org/drawingml/2006/picture">
                 <pic:pic xmlns:pic="http://schemas.openxmlformats.org/drawingml/2006/picture">
                   <pic:nvPicPr>
-                    <pic:cNvPr id="276586682" name=""/>
+                    <pic:cNvPr id="1733692462" name="Imagem 1733692462"/>
                     <pic:cNvPicPr/>
                   </pic:nvPicPr>
                   <pic:blipFill>
-                    <a:blip r:embed="rId5"/>
+                    <a:blip r:embed="rId5">
+                      <a:extLst>
+                        <a:ext uri="{28A0092B-C50C-407E-A947-70E740481C1C}">
+                          <a14:useLocalDpi xmlns:a14="http://schemas.microsoft.com/office/drawing/2010/main" val="0"/>
+                        </a:ext>
+                      </a:extLst>
+                    </a:blip>
                     <a:stretch>
                       <a:fillRect/>
                     </a:stretch>
@@ -3510,7 +1564,7 @@
                   <pic:spPr>
                     <a:xfrm>
                       <a:off x="0" y="0"/>
-                      <a:ext cx="6242507" cy="5263262"/>
+                      <a:ext cx="5400040" cy="6267450"/>
                     </a:xfrm>
                     <a:prstGeom prst="rect">
                       <a:avLst/>

</xml_diff>